<commit_message>
Testing and debugging the workflow engine
</commit_message>
<xml_diff>
--- a/Documentation/AI Prompts/Vibe Coding - Workflow Configuration.docx
+++ b/Documentation/AI Prompts/Vibe Coding - Workflow Configuration.docx
@@ -1166,16 +1166,7 @@
       </w:r>
       <w:proofErr w:type="spellEnd"/>
       <w:r>
-        <w:t>’</w:t>
-      </w:r>
-      <w:r>
-        <w:t xml:space="preserve"> does not contain a definition for</w:t>
-      </w:r>
-      <w:r>
-        <w:t xml:space="preserve"> </w:t>
-      </w:r>
-      <w:r>
-        <w:t>‘</w:t>
+        <w:t>’ does not contain a definition for ‘</w:t>
       </w:r>
       <w:proofErr w:type="spellStart"/>
       <w:r>
@@ -1191,10 +1182,7 @@
       </w:r>
       <w:proofErr w:type="spellEnd"/>
       <w:r>
-        <w:t>’</w:t>
-      </w:r>
-      <w:r>
-        <w:t xml:space="preserve"> accepting first argument of type ‘</w:t>
+        <w:t>’ accepting first argument of type ‘</w:t>
       </w:r>
       <w:proofErr w:type="spellStart"/>
       <w:r>
@@ -1202,10 +1190,7 @@
       </w:r>
       <w:proofErr w:type="spellEnd"/>
       <w:r>
-        <w:t xml:space="preserve">’ could be found </w:t>
-      </w:r>
-      <w:r>
-        <w:t>(are you missing a using directive or an assembly reference?)</w:t>
+        <w:t>’ could be found (are you missing a using directive or an assembly reference?)</w:t>
       </w:r>
     </w:p>
     <w:p>
@@ -5373,6 +5358,563 @@
         <w:spacing w:after="0"/>
       </w:pPr>
       <w:r>
+        <w:t>}</w:t>
+      </w:r>
+    </w:p>
+    <w:p>
+      <w:pPr>
+        <w:spacing w:after="0"/>
+      </w:pPr>
+    </w:p>
+    <w:p>
+      <w:pPr>
+        <w:spacing w:after="0"/>
+        <w:rPr>
+          <w:b/>
+          <w:bCs/>
+          <w:color w:val="EE0000"/>
+          <w:u w:val="single"/>
+        </w:rPr>
+      </w:pPr>
+      <w:r>
+        <w:rPr>
+          <w:b/>
+          <w:bCs/>
+          <w:color w:val="EE0000"/>
+          <w:u w:val="single"/>
+        </w:rPr>
+        <w:t>Prompt #5:</w:t>
+      </w:r>
+    </w:p>
+    <w:p>
+      <w:pPr>
+        <w:spacing w:after="0"/>
+      </w:pPr>
+    </w:p>
+    <w:p>
+      <w:pPr>
+        <w:spacing w:after="0"/>
+      </w:pPr>
+      <w:r>
+        <w:t>Tell me where to write the below code in my HRMS Blazor project. Note that I am using Clean Architecture development pattern.</w:t>
+      </w:r>
+    </w:p>
+    <w:p>
+      <w:pPr>
+        <w:spacing w:after="0"/>
+      </w:pPr>
+    </w:p>
+    <w:p>
+      <w:pPr>
+        <w:spacing w:after="0"/>
+        <w:rPr>
+          <w:b/>
+          <w:bCs/>
+        </w:rPr>
+      </w:pPr>
+      <w:r>
+        <w:rPr>
+          <w:b/>
+          <w:bCs/>
+        </w:rPr>
+        <w:t>1. WORKFLOW SEEDING (EF CORE)</w:t>
+      </w:r>
+    </w:p>
+    <w:p>
+      <w:pPr>
+        <w:spacing w:after="0"/>
+      </w:pPr>
+      <w:r>
+        <w:t>This configures your leave workflow automatically at startup.</w:t>
+      </w:r>
+    </w:p>
+    <w:p>
+      <w:pPr>
+        <w:spacing w:after="0"/>
+        <w:rPr>
+          <w:b/>
+          <w:bCs/>
+        </w:rPr>
+      </w:pPr>
+      <w:proofErr w:type="spellStart"/>
+      <w:r>
+        <w:rPr>
+          <w:b/>
+          <w:bCs/>
+        </w:rPr>
+        <w:t>SeedWorkflowData.cs</w:t>
+      </w:r>
+      <w:proofErr w:type="spellEnd"/>
+    </w:p>
+    <w:p>
+      <w:pPr>
+        <w:spacing w:after="0"/>
+      </w:pPr>
+      <w:r>
+        <w:t xml:space="preserve">public static class </w:t>
+      </w:r>
+      <w:proofErr w:type="spellStart"/>
+      <w:r>
+        <w:t>WorkflowSeedData</w:t>
+      </w:r>
+      <w:proofErr w:type="spellEnd"/>
+      <w:r>
+        <w:br/>
+        <w:t>{</w:t>
+      </w:r>
+      <w:r>
+        <w:br/>
+        <w:t xml:space="preserve">    public static async Task </w:t>
+      </w:r>
+      <w:proofErr w:type="spellStart"/>
+      <w:r>
+        <w:t>SeedAsync</w:t>
+      </w:r>
+      <w:proofErr w:type="spellEnd"/>
+      <w:r>
+        <w:t>(</w:t>
+      </w:r>
+      <w:proofErr w:type="spellStart"/>
+      <w:r>
+        <w:t>ApplicationDbContext</w:t>
+      </w:r>
+      <w:proofErr w:type="spellEnd"/>
+      <w:r>
+        <w:t xml:space="preserve"> </w:t>
+      </w:r>
+      <w:proofErr w:type="spellStart"/>
+      <w:r>
+        <w:t>db</w:t>
+      </w:r>
+      <w:proofErr w:type="spellEnd"/>
+      <w:r>
+        <w:t>)</w:t>
+      </w:r>
+      <w:r>
+        <w:br/>
+        <w:t xml:space="preserve">    {</w:t>
+      </w:r>
+      <w:r>
+        <w:br/>
+        <w:t xml:space="preserve">        if (await </w:t>
+      </w:r>
+      <w:proofErr w:type="spellStart"/>
+      <w:r>
+        <w:t>db.WorkflowDefinitions.AnyAsync</w:t>
+      </w:r>
+      <w:proofErr w:type="spellEnd"/>
+      <w:r>
+        <w:t xml:space="preserve">(x =&gt; </w:t>
+      </w:r>
+      <w:proofErr w:type="spellStart"/>
+      <w:r>
+        <w:t>x.Name</w:t>
+      </w:r>
+      <w:proofErr w:type="spellEnd"/>
+      <w:r>
+        <w:t xml:space="preserve"> == "Leave Workflow"))</w:t>
+      </w:r>
+      <w:r>
+        <w:br/>
+        <w:t xml:space="preserve">            return;</w:t>
+      </w:r>
+      <w:r>
+        <w:br/>
+      </w:r>
+      <w:r>
+        <w:br/>
+        <w:t xml:space="preserve">        var workflow = new </w:t>
+      </w:r>
+      <w:proofErr w:type="spellStart"/>
+      <w:r>
+        <w:t>WorkflowDefinition</w:t>
+      </w:r>
+      <w:proofErr w:type="spellEnd"/>
+      <w:r>
+        <w:br/>
+        <w:t xml:space="preserve">        {</w:t>
+      </w:r>
+      <w:r>
+        <w:br/>
+        <w:t xml:space="preserve">            Name = "Leave Workflow",</w:t>
+      </w:r>
+      <w:r>
+        <w:br/>
+        <w:t xml:space="preserve">            </w:t>
+      </w:r>
+      <w:proofErr w:type="spellStart"/>
+      <w:r>
+        <w:t>EntityName</w:t>
+      </w:r>
+      <w:proofErr w:type="spellEnd"/>
+      <w:r>
+        <w:t xml:space="preserve"> = "</w:t>
+      </w:r>
+      <w:proofErr w:type="spellStart"/>
+      <w:r>
+        <w:t>LeaveRequisitionWF</w:t>
+      </w:r>
+      <w:proofErr w:type="spellEnd"/>
+      <w:r>
+        <w:t>",</w:t>
+      </w:r>
+      <w:r>
+        <w:br/>
+        <w:t xml:space="preserve">            </w:t>
+      </w:r>
+      <w:proofErr w:type="spellStart"/>
+      <w:r>
+        <w:t>IsActive</w:t>
+      </w:r>
+      <w:proofErr w:type="spellEnd"/>
+      <w:r>
+        <w:t xml:space="preserve"> = true,</w:t>
+      </w:r>
+      <w:r>
+        <w:br/>
+        <w:t xml:space="preserve">            Steps = new List&lt;</w:t>
+      </w:r>
+      <w:proofErr w:type="spellStart"/>
+      <w:r>
+        <w:t>WorkflowStepDefinition</w:t>
+      </w:r>
+      <w:proofErr w:type="spellEnd"/>
+      <w:r>
+        <w:t>&gt;</w:t>
+      </w:r>
+      <w:r>
+        <w:br/>
+        <w:t xml:space="preserve">            {</w:t>
+      </w:r>
+      <w:r>
+        <w:br/>
+        <w:t xml:space="preserve">                new </w:t>
+      </w:r>
+      <w:proofErr w:type="spellStart"/>
+      <w:r>
+        <w:t>WorkflowStepDefinition</w:t>
+      </w:r>
+      <w:proofErr w:type="spellEnd"/>
+      <w:r>
+        <w:br/>
+        <w:t xml:space="preserve">                {</w:t>
+      </w:r>
+      <w:r>
+        <w:br/>
+        <w:t xml:space="preserve">                    </w:t>
+      </w:r>
+      <w:proofErr w:type="spellStart"/>
+      <w:r>
+        <w:t>StepOrder</w:t>
+      </w:r>
+      <w:proofErr w:type="spellEnd"/>
+      <w:r>
+        <w:t xml:space="preserve"> = 1,</w:t>
+      </w:r>
+      <w:r>
+        <w:br/>
+      </w:r>
+      <w:r>
+        <w:lastRenderedPageBreak/>
+        <w:t xml:space="preserve">                    </w:t>
+      </w:r>
+      <w:proofErr w:type="spellStart"/>
+      <w:r>
+        <w:t>StepName</w:t>
+      </w:r>
+      <w:proofErr w:type="spellEnd"/>
+      <w:r>
+        <w:t xml:space="preserve"> = "Supervisor Approval",</w:t>
+      </w:r>
+      <w:r>
+        <w:br/>
+        <w:t xml:space="preserve">                    </w:t>
+      </w:r>
+      <w:proofErr w:type="spellStart"/>
+      <w:r>
+        <w:t>ApprovalRole</w:t>
+      </w:r>
+      <w:proofErr w:type="spellEnd"/>
+      <w:r>
+        <w:t xml:space="preserve"> = "SUPERVISOR",</w:t>
+      </w:r>
+      <w:r>
+        <w:br/>
+        <w:t xml:space="preserve">                    </w:t>
+      </w:r>
+      <w:proofErr w:type="spellStart"/>
+      <w:r>
+        <w:t>IsParallelGroup</w:t>
+      </w:r>
+      <w:proofErr w:type="spellEnd"/>
+      <w:r>
+        <w:t xml:space="preserve"> = false</w:t>
+      </w:r>
+      <w:r>
+        <w:br/>
+        <w:t xml:space="preserve">                },</w:t>
+      </w:r>
+      <w:r>
+        <w:br/>
+        <w:t xml:space="preserve">                new </w:t>
+      </w:r>
+      <w:proofErr w:type="spellStart"/>
+      <w:r>
+        <w:t>WorkflowStepDefinition</w:t>
+      </w:r>
+      <w:proofErr w:type="spellEnd"/>
+      <w:r>
+        <w:br/>
+        <w:t xml:space="preserve">                {</w:t>
+      </w:r>
+      <w:r>
+        <w:br/>
+        <w:t xml:space="preserve">                    </w:t>
+      </w:r>
+      <w:proofErr w:type="spellStart"/>
+      <w:r>
+        <w:t>StepOrder</w:t>
+      </w:r>
+      <w:proofErr w:type="spellEnd"/>
+      <w:r>
+        <w:t xml:space="preserve"> = 2,</w:t>
+      </w:r>
+      <w:r>
+        <w:br/>
+        <w:t xml:space="preserve">                    </w:t>
+      </w:r>
+      <w:proofErr w:type="spellStart"/>
+      <w:r>
+        <w:t>StepName</w:t>
+      </w:r>
+      <w:proofErr w:type="spellEnd"/>
+      <w:r>
+        <w:t xml:space="preserve"> = "HR Approval",</w:t>
+      </w:r>
+      <w:r>
+        <w:br/>
+        <w:t xml:space="preserve">                    </w:t>
+      </w:r>
+      <w:proofErr w:type="spellStart"/>
+      <w:r>
+        <w:t>ApprovalRole</w:t>
+      </w:r>
+      <w:proofErr w:type="spellEnd"/>
+      <w:r>
+        <w:t xml:space="preserve"> = "HR",</w:t>
+      </w:r>
+      <w:r>
+        <w:br/>
+        <w:t xml:space="preserve">                    </w:t>
+      </w:r>
+      <w:proofErr w:type="spellStart"/>
+      <w:r>
+        <w:t>IsParallelGroup</w:t>
+      </w:r>
+      <w:proofErr w:type="spellEnd"/>
+      <w:r>
+        <w:t xml:space="preserve"> = false</w:t>
+      </w:r>
+      <w:r>
+        <w:br/>
+        <w:t xml:space="preserve">                },</w:t>
+      </w:r>
+      <w:r>
+        <w:br/>
+        <w:t xml:space="preserve">                new </w:t>
+      </w:r>
+      <w:proofErr w:type="spellStart"/>
+      <w:r>
+        <w:t>WorkflowStepDefinition</w:t>
+      </w:r>
+      <w:proofErr w:type="spellEnd"/>
+      <w:r>
+        <w:br/>
+        <w:t xml:space="preserve">                {</w:t>
+      </w:r>
+      <w:r>
+        <w:br/>
+        <w:t xml:space="preserve">                    </w:t>
+      </w:r>
+      <w:proofErr w:type="spellStart"/>
+      <w:r>
+        <w:t>StepOrder</w:t>
+      </w:r>
+      <w:proofErr w:type="spellEnd"/>
+      <w:r>
+        <w:t xml:space="preserve"> = 3,</w:t>
+      </w:r>
+      <w:r>
+        <w:br/>
+        <w:t xml:space="preserve">                    </w:t>
+      </w:r>
+      <w:proofErr w:type="spellStart"/>
+      <w:r>
+        <w:t>StepName</w:t>
+      </w:r>
+      <w:proofErr w:type="spellEnd"/>
+      <w:r>
+        <w:t xml:space="preserve"> = "General Manager Approval",</w:t>
+      </w:r>
+      <w:r>
+        <w:br/>
+        <w:t xml:space="preserve">                    </w:t>
+      </w:r>
+      <w:proofErr w:type="spellStart"/>
+      <w:r>
+        <w:t>ApprovalRole</w:t>
+      </w:r>
+      <w:proofErr w:type="spellEnd"/>
+      <w:r>
+        <w:t xml:space="preserve"> = "GM",</w:t>
+      </w:r>
+      <w:r>
+        <w:br/>
+        <w:t xml:space="preserve">                    </w:t>
+      </w:r>
+      <w:proofErr w:type="spellStart"/>
+      <w:r>
+        <w:t>IsParallelGroup</w:t>
+      </w:r>
+      <w:proofErr w:type="spellEnd"/>
+      <w:r>
+        <w:t xml:space="preserve"> = false</w:t>
+      </w:r>
+      <w:r>
+        <w:br/>
+        <w:t xml:space="preserve">                }</w:t>
+      </w:r>
+      <w:r>
+        <w:br/>
+        <w:t xml:space="preserve">            }</w:t>
+      </w:r>
+      <w:r>
+        <w:br/>
+        <w:t xml:space="preserve">        };</w:t>
+      </w:r>
+      <w:r>
+        <w:br/>
+      </w:r>
+      <w:r>
+        <w:br/>
+        <w:t xml:space="preserve">        </w:t>
+      </w:r>
+      <w:proofErr w:type="spellStart"/>
+      <w:r>
+        <w:t>db.WorkflowDefinitions.Add</w:t>
+      </w:r>
+      <w:proofErr w:type="spellEnd"/>
+      <w:r>
+        <w:t>(workflow);</w:t>
+      </w:r>
+      <w:r>
+        <w:br/>
+        <w:t xml:space="preserve">        await </w:t>
+      </w:r>
+      <w:proofErr w:type="spellStart"/>
+      <w:r>
+        <w:t>db.SaveChangesAsync</w:t>
+      </w:r>
+      <w:proofErr w:type="spellEnd"/>
+      <w:r>
+        <w:t>();</w:t>
+      </w:r>
+      <w:r>
+        <w:br/>
+        <w:t xml:space="preserve">    }</w:t>
+      </w:r>
+      <w:r>
+        <w:br/>
+        <w:t>}</w:t>
+      </w:r>
+    </w:p>
+    <w:p>
+      <w:pPr>
+        <w:spacing w:after="0"/>
+        <w:rPr>
+          <w:b/>
+          <w:bCs/>
+        </w:rPr>
+      </w:pPr>
+      <w:r>
+        <w:rPr>
+          <w:b/>
+          <w:bCs/>
+        </w:rPr>
+        <w:t>Register at app startup</w:t>
+      </w:r>
+    </w:p>
+    <w:p>
+      <w:pPr>
+        <w:spacing w:after="0"/>
+      </w:pPr>
+      <w:r>
+        <w:t xml:space="preserve">using (var scope = </w:t>
+      </w:r>
+      <w:proofErr w:type="spellStart"/>
+      <w:proofErr w:type="gramStart"/>
+      <w:r>
+        <w:t>app.Services.CreateScope</w:t>
+      </w:r>
+      <w:proofErr w:type="spellEnd"/>
+      <w:proofErr w:type="gramEnd"/>
+      <w:r>
+        <w:t>())</w:t>
+      </w:r>
+      <w:r>
+        <w:br/>
+        <w:t>{</w:t>
+      </w:r>
+      <w:r>
+        <w:br/>
+        <w:t xml:space="preserve">    var </w:t>
+      </w:r>
+      <w:proofErr w:type="spellStart"/>
+      <w:r>
+        <w:t>db</w:t>
+      </w:r>
+      <w:proofErr w:type="spellEnd"/>
+      <w:r>
+        <w:t xml:space="preserve"> = </w:t>
+      </w:r>
+      <w:proofErr w:type="gramStart"/>
+      <w:r>
+        <w:t>scope.ServiceProvider.GetRequiredService</w:t>
+      </w:r>
+      <w:proofErr w:type="gramEnd"/>
+      <w:r>
+        <w:t>&lt;ApplicationDbContext</w:t>
+      </w:r>
+      <w:proofErr w:type="gramStart"/>
+      <w:r>
+        <w:t>&gt;(</w:t>
+      </w:r>
+      <w:proofErr w:type="gramEnd"/>
+      <w:r>
+        <w:t>);</w:t>
+      </w:r>
+      <w:r>
+        <w:br/>
+        <w:t xml:space="preserve">    await </w:t>
+      </w:r>
+      <w:proofErr w:type="spellStart"/>
+      <w:r>
+        <w:t>WorkflowSeedData.SeedAsync</w:t>
+      </w:r>
+      <w:proofErr w:type="spellEnd"/>
+      <w:r>
+        <w:t>(</w:t>
+      </w:r>
+      <w:proofErr w:type="spellStart"/>
+      <w:r>
+        <w:t>db</w:t>
+      </w:r>
+      <w:proofErr w:type="spellEnd"/>
+      <w:r>
+        <w:t>);</w:t>
+      </w:r>
+      <w:r>
+        <w:br/>
         <w:t>}</w:t>
       </w:r>
     </w:p>

</xml_diff>

<commit_message>
Completed fixing all bugs and refactored the workflow engine to handle parallel approval and complex conditions.
</commit_message>
<xml_diff>
--- a/Documentation/AI Prompts/Vibe Coding - Workflow Configuration.docx
+++ b/Documentation/AI Prompts/Vibe Coding - Workflow Configuration.docx
@@ -23256,6 +23256,1203 @@
     <w:p>
       <w:pPr>
         <w:spacing w:after="0"/>
+        <w:rPr>
+          <w:lang w:val="en-GB"/>
+        </w:rPr>
+      </w:pPr>
+      <w:r>
+        <w:rPr>
+          <w:lang w:val="en-GB"/>
+        </w:rPr>
+        <w:t>}</w:t>
+      </w:r>
+    </w:p>
+    <w:p>
+      <w:pPr>
+        <w:rPr>
+          <w:lang w:val="en-GB"/>
+        </w:rPr>
+      </w:pPr>
+      <w:r>
+        <w:rPr>
+          <w:lang w:val="en-GB"/>
+        </w:rPr>
+        <w:br w:type="page"/>
+      </w:r>
+    </w:p>
+    <w:p>
+      <w:pPr>
+        <w:spacing w:after="0"/>
+        <w:rPr>
+          <w:b/>
+          <w:bCs/>
+          <w:color w:val="EE0000"/>
+          <w:u w:val="single"/>
+          <w:lang w:val="en-GB"/>
+        </w:rPr>
+      </w:pPr>
+      <w:r>
+        <w:rPr>
+          <w:b/>
+          <w:bCs/>
+          <w:color w:val="EE0000"/>
+          <w:u w:val="single"/>
+          <w:lang w:val="en-GB"/>
+        </w:rPr>
+        <w:lastRenderedPageBreak/>
+        <w:t>AI Prompt:</w:t>
+      </w:r>
+    </w:p>
+    <w:p>
+      <w:pPr>
+        <w:spacing w:after="0"/>
+        <w:rPr>
+          <w:lang w:val="en-GB"/>
+        </w:rPr>
+      </w:pPr>
+    </w:p>
+    <w:p>
+      <w:pPr>
+        <w:spacing w:after="0"/>
+        <w:rPr>
+          <w:lang w:val="en-GB"/>
+        </w:rPr>
+      </w:pPr>
+      <w:r>
+        <w:rPr>
+          <w:lang w:val="en-GB"/>
+        </w:rPr>
+        <w:t xml:space="preserve">The below code block throws an error that says: </w:t>
+      </w:r>
+    </w:p>
+    <w:p>
+      <w:pPr>
+        <w:spacing w:after="0"/>
+      </w:pPr>
+      <w:proofErr w:type="spellStart"/>
+      <w:r>
+        <w:rPr>
+          <w:b/>
+        </w:rPr>
+        <w:t>System.InvalidOperationException</w:t>
+      </w:r>
+      <w:proofErr w:type="spellEnd"/>
+      <w:r>
+        <w:rPr>
+          <w:b/>
+        </w:rPr>
+        <w:t>:</w:t>
+      </w:r>
+      <w:r>
+        <w:t xml:space="preserve"> 'The binary operator </w:t>
+      </w:r>
+      <w:proofErr w:type="spellStart"/>
+      <w:r>
+        <w:t>GreaterThan</w:t>
+      </w:r>
+      <w:proofErr w:type="spellEnd"/>
+      <w:r>
+        <w:t xml:space="preserve"> is not defined for the types '</w:t>
+      </w:r>
+      <w:proofErr w:type="spellStart"/>
+      <w:r>
+        <w:t>System.Object</w:t>
+      </w:r>
+      <w:proofErr w:type="spellEnd"/>
+      <w:r>
+        <w:t>' and 'System.Int32'.'</w:t>
+      </w:r>
+    </w:p>
+    <w:p>
+      <w:pPr>
+        <w:spacing w:after="0"/>
+        <w:rPr>
+          <w:lang w:val="en-GB"/>
+        </w:rPr>
+      </w:pPr>
+    </w:p>
+    <w:p>
+      <w:pPr>
+        <w:spacing w:after="0"/>
+        <w:rPr>
+          <w:lang w:val="en-GB"/>
+        </w:rPr>
+      </w:pPr>
+      <w:r>
+        <w:rPr>
+          <w:lang w:val="en-GB"/>
+        </w:rPr>
+        <w:t xml:space="preserve">Note the calling the </w:t>
+      </w:r>
+      <w:proofErr w:type="spellStart"/>
+      <w:proofErr w:type="gramStart"/>
+      <w:r>
+        <w:rPr>
+          <w:lang w:val="en-GB"/>
+        </w:rPr>
+        <w:t>NormalizeExpression</w:t>
+      </w:r>
+      <w:proofErr w:type="spellEnd"/>
+      <w:r>
+        <w:rPr>
+          <w:lang w:val="en-GB"/>
+        </w:rPr>
+        <w:t>(</w:t>
+      </w:r>
+      <w:proofErr w:type="gramEnd"/>
+      <w:r>
+        <w:rPr>
+          <w:lang w:val="en-GB"/>
+        </w:rPr>
+        <w:t>) method returns the following expression output:</w:t>
+      </w:r>
+    </w:p>
+    <w:p>
+      <w:pPr>
+        <w:spacing w:after="0"/>
+        <w:rPr>
+          <w:lang w:val="en-GB"/>
+        </w:rPr>
+      </w:pPr>
+      <w:r>
+        <w:rPr>
+          <w:lang w:val="en-GB"/>
+        </w:rPr>
+        <w:t>"</w:t>
+      </w:r>
+      <w:proofErr w:type="spellStart"/>
+      <w:r>
+        <w:rPr>
+          <w:lang w:val="en-GB"/>
+        </w:rPr>
+        <w:t>LeaveType</w:t>
+      </w:r>
+      <w:proofErr w:type="spellEnd"/>
+      <w:r>
+        <w:rPr>
+          <w:lang w:val="en-GB"/>
+        </w:rPr>
+        <w:t xml:space="preserve"> == \"AL\" &amp;&amp; </w:t>
+      </w:r>
+      <w:proofErr w:type="spellStart"/>
+      <w:r>
+        <w:rPr>
+          <w:lang w:val="en-GB"/>
+        </w:rPr>
+        <w:t>LeaveDuration</w:t>
+      </w:r>
+      <w:proofErr w:type="spellEnd"/>
+      <w:r>
+        <w:rPr>
+          <w:lang w:val="en-GB"/>
+        </w:rPr>
+        <w:t xml:space="preserve"> &gt; 15"</w:t>
+      </w:r>
+    </w:p>
+    <w:p>
+      <w:pPr>
+        <w:spacing w:after="0"/>
+        <w:rPr>
+          <w:lang w:val="en-GB"/>
+        </w:rPr>
+      </w:pPr>
+    </w:p>
+    <w:p>
+      <w:pPr>
+        <w:spacing w:after="0"/>
+        <w:rPr>
+          <w:lang w:val="en-GB"/>
+        </w:rPr>
+      </w:pPr>
+      <w:r>
+        <w:rPr>
+          <w:lang w:val="en-GB"/>
+        </w:rPr>
+        <w:t>Provide production-ready fix to resolve this issue.</w:t>
+      </w:r>
+    </w:p>
+    <w:p>
+      <w:pPr>
+        <w:spacing w:after="0"/>
+        <w:rPr>
+          <w:lang w:val="en-GB"/>
+        </w:rPr>
+      </w:pPr>
+    </w:p>
+    <w:p>
+      <w:pPr>
+        <w:spacing w:after="0"/>
+        <w:rPr>
+          <w:u w:val="single"/>
+          <w:lang w:val="en-GB"/>
+        </w:rPr>
+      </w:pPr>
+      <w:r>
+        <w:rPr>
+          <w:u w:val="single"/>
+          <w:lang w:val="en-GB"/>
+        </w:rPr>
+        <w:t>Code Block:</w:t>
+      </w:r>
+    </w:p>
+    <w:p>
+      <w:pPr>
+        <w:spacing w:after="0"/>
+        <w:rPr>
+          <w:lang w:val="en-GB"/>
+        </w:rPr>
+      </w:pPr>
+      <w:r>
+        <w:rPr>
+          <w:lang w:val="en-GB"/>
+        </w:rPr>
+        <w:t>// ============================================</w:t>
+      </w:r>
+    </w:p>
+    <w:p>
+      <w:pPr>
+        <w:spacing w:after="0"/>
+        <w:rPr>
+          <w:lang w:val="en-GB"/>
+        </w:rPr>
+      </w:pPr>
+      <w:r>
+        <w:rPr>
+          <w:lang w:val="en-GB"/>
+        </w:rPr>
+        <w:t xml:space="preserve">// </w:t>
+      </w:r>
+      <w:r>
+        <w:rPr>
+          <w:rFonts w:ascii="Segoe UI Emoji" w:hAnsi="Segoe UI Emoji" w:cs="Segoe UI Emoji"/>
+          <w:lang w:val="en-GB"/>
+        </w:rPr>
+        <w:t>✅</w:t>
+      </w:r>
+      <w:r>
+        <w:rPr>
+          <w:lang w:val="en-GB"/>
+        </w:rPr>
+        <w:t xml:space="preserve"> USE EXPRESSION FIRST (NEW ENGINE)</w:t>
+      </w:r>
+    </w:p>
+    <w:p>
+      <w:pPr>
+        <w:spacing w:after="0"/>
+        <w:rPr>
+          <w:lang w:val="en-GB"/>
+        </w:rPr>
+      </w:pPr>
+      <w:r>
+        <w:rPr>
+          <w:lang w:val="en-GB"/>
+        </w:rPr>
+        <w:t>// ============================================</w:t>
+      </w:r>
+    </w:p>
+    <w:p>
+      <w:pPr>
+        <w:spacing w:after="0"/>
+        <w:rPr>
+          <w:lang w:val="en-GB"/>
+        </w:rPr>
+      </w:pPr>
+      <w:r>
+        <w:rPr>
+          <w:lang w:val="en-GB"/>
+        </w:rPr>
+        <w:t xml:space="preserve">if </w:t>
+      </w:r>
+      <w:proofErr w:type="gramStart"/>
+      <w:r>
+        <w:rPr>
+          <w:lang w:val="en-GB"/>
+        </w:rPr>
+        <w:t>(!</w:t>
+      </w:r>
+      <w:proofErr w:type="spellStart"/>
+      <w:r>
+        <w:rPr>
+          <w:lang w:val="en-GB"/>
+        </w:rPr>
+        <w:t>string</w:t>
+      </w:r>
+      <w:proofErr w:type="gramEnd"/>
+      <w:r>
+        <w:rPr>
+          <w:lang w:val="en-GB"/>
+        </w:rPr>
+        <w:t>.IsNullOrWhiteSpace</w:t>
+      </w:r>
+      <w:proofErr w:type="spellEnd"/>
+      <w:r>
+        <w:rPr>
+          <w:lang w:val="en-GB"/>
+        </w:rPr>
+        <w:t>(</w:t>
+      </w:r>
+      <w:proofErr w:type="spellStart"/>
+      <w:proofErr w:type="gramStart"/>
+      <w:r>
+        <w:rPr>
+          <w:lang w:val="en-GB"/>
+        </w:rPr>
+        <w:t>condition.Expression</w:t>
+      </w:r>
+      <w:proofErr w:type="spellEnd"/>
+      <w:proofErr w:type="gramEnd"/>
+      <w:r>
+        <w:rPr>
+          <w:lang w:val="en-GB"/>
+        </w:rPr>
+        <w:t>))</w:t>
+      </w:r>
+    </w:p>
+    <w:p>
+      <w:pPr>
+        <w:spacing w:after="0"/>
+        <w:rPr>
+          <w:lang w:val="en-GB"/>
+        </w:rPr>
+      </w:pPr>
+      <w:r>
+        <w:rPr>
+          <w:lang w:val="en-GB"/>
+        </w:rPr>
+        <w:t>{</w:t>
+      </w:r>
+    </w:p>
+    <w:p>
+      <w:pPr>
+        <w:spacing w:after="0"/>
+        <w:rPr>
+          <w:lang w:val="en-GB"/>
+        </w:rPr>
+      </w:pPr>
+      <w:r>
+        <w:rPr>
+          <w:lang w:val="en-GB"/>
+        </w:rPr>
+        <w:t xml:space="preserve">    var normalized = </w:t>
+      </w:r>
+      <w:proofErr w:type="spellStart"/>
+      <w:r>
+        <w:rPr>
+          <w:lang w:val="en-GB"/>
+        </w:rPr>
+        <w:t>NormalizeExpression</w:t>
+      </w:r>
+      <w:proofErr w:type="spellEnd"/>
+      <w:r>
+        <w:rPr>
+          <w:lang w:val="en-GB"/>
+        </w:rPr>
+        <w:t>(</w:t>
+      </w:r>
+      <w:proofErr w:type="spellStart"/>
+      <w:proofErr w:type="gramStart"/>
+      <w:r>
+        <w:rPr>
+          <w:lang w:val="en-GB"/>
+        </w:rPr>
+        <w:t>condition.Expression</w:t>
+      </w:r>
+      <w:proofErr w:type="spellEnd"/>
+      <w:r>
+        <w:rPr>
+          <w:lang w:val="en-GB"/>
+        </w:rPr>
+        <w:t>);</w:t>
+      </w:r>
+      <w:proofErr w:type="gramEnd"/>
+    </w:p>
+    <w:p>
+      <w:pPr>
+        <w:spacing w:after="0"/>
+        <w:rPr>
+          <w:lang w:val="en-GB"/>
+        </w:rPr>
+      </w:pPr>
+    </w:p>
+    <w:p>
+      <w:pPr>
+        <w:spacing w:after="0"/>
+        <w:rPr>
+          <w:lang w:val="en-GB"/>
+        </w:rPr>
+      </w:pPr>
+      <w:r>
+        <w:rPr>
+          <w:lang w:val="en-GB"/>
+        </w:rPr>
+        <w:t xml:space="preserve">    if (</w:t>
+      </w:r>
+      <w:proofErr w:type="spellStart"/>
+      <w:proofErr w:type="gramStart"/>
+      <w:r>
+        <w:rPr>
+          <w:lang w:val="en-GB"/>
+        </w:rPr>
+        <w:t>string.IsNullOrWhiteSpace</w:t>
+      </w:r>
+      <w:proofErr w:type="spellEnd"/>
+      <w:proofErr w:type="gramEnd"/>
+      <w:r>
+        <w:rPr>
+          <w:lang w:val="en-GB"/>
+        </w:rPr>
+        <w:t>(normalized))</w:t>
+      </w:r>
+    </w:p>
+    <w:p>
+      <w:pPr>
+        <w:spacing w:after="0"/>
+        <w:rPr>
+          <w:lang w:val="en-GB"/>
+        </w:rPr>
+      </w:pPr>
+      <w:r>
+        <w:rPr>
+          <w:lang w:val="en-GB"/>
+        </w:rPr>
+        <w:t xml:space="preserve">        return </w:t>
+      </w:r>
+      <w:proofErr w:type="gramStart"/>
+      <w:r>
+        <w:rPr>
+          <w:lang w:val="en-GB"/>
+        </w:rPr>
+        <w:t>false;</w:t>
+      </w:r>
+      <w:proofErr w:type="gramEnd"/>
+    </w:p>
+    <w:p>
+      <w:pPr>
+        <w:spacing w:after="0"/>
+        <w:rPr>
+          <w:lang w:val="en-GB"/>
+        </w:rPr>
+      </w:pPr>
+    </w:p>
+    <w:p>
+      <w:pPr>
+        <w:spacing w:after="0"/>
+        <w:rPr>
+          <w:lang w:val="en-GB"/>
+        </w:rPr>
+      </w:pPr>
+      <w:r>
+        <w:rPr>
+          <w:lang w:val="en-GB"/>
+        </w:rPr>
+        <w:t xml:space="preserve">    // Convert single object → </w:t>
+      </w:r>
+      <w:proofErr w:type="spellStart"/>
+      <w:r>
+        <w:rPr>
+          <w:lang w:val="en-GB"/>
+        </w:rPr>
+        <w:t>IQueryable</w:t>
+      </w:r>
+      <w:proofErr w:type="spellEnd"/>
+    </w:p>
+    <w:p>
+      <w:pPr>
+        <w:spacing w:after="0"/>
+        <w:rPr>
+          <w:lang w:val="en-GB"/>
+        </w:rPr>
+      </w:pPr>
+      <w:r>
+        <w:rPr>
+          <w:lang w:val="en-GB"/>
+        </w:rPr>
+        <w:t xml:space="preserve">    var </w:t>
+      </w:r>
+      <w:proofErr w:type="spellStart"/>
+      <w:r>
+        <w:rPr>
+          <w:lang w:val="en-GB"/>
+        </w:rPr>
+        <w:t>queryable</w:t>
+      </w:r>
+      <w:proofErr w:type="spellEnd"/>
+      <w:r>
+        <w:rPr>
+          <w:lang w:val="en-GB"/>
+        </w:rPr>
+        <w:t xml:space="preserve"> = </w:t>
+      </w:r>
+      <w:proofErr w:type="gramStart"/>
+      <w:r>
+        <w:rPr>
+          <w:lang w:val="en-GB"/>
+        </w:rPr>
+        <w:t>new[</w:t>
+      </w:r>
+      <w:proofErr w:type="gramEnd"/>
+      <w:r>
+        <w:rPr>
+          <w:lang w:val="en-GB"/>
+        </w:rPr>
+        <w:t xml:space="preserve">] </w:t>
+      </w:r>
+      <w:proofErr w:type="gramStart"/>
+      <w:r>
+        <w:rPr>
+          <w:lang w:val="en-GB"/>
+        </w:rPr>
+        <w:t>{ entity</w:t>
+      </w:r>
+      <w:proofErr w:type="gramEnd"/>
+      <w:r>
+        <w:rPr>
+          <w:lang w:val="en-GB"/>
+        </w:rPr>
+        <w:t xml:space="preserve"> </w:t>
+      </w:r>
+      <w:proofErr w:type="gramStart"/>
+      <w:r>
+        <w:rPr>
+          <w:lang w:val="en-GB"/>
+        </w:rPr>
+        <w:t>}.</w:t>
+      </w:r>
+      <w:proofErr w:type="spellStart"/>
+      <w:r>
+        <w:rPr>
+          <w:lang w:val="en-GB"/>
+        </w:rPr>
+        <w:t>AsQueryable</w:t>
+      </w:r>
+      <w:proofErr w:type="spellEnd"/>
+      <w:proofErr w:type="gramEnd"/>
+      <w:r>
+        <w:rPr>
+          <w:lang w:val="en-GB"/>
+        </w:rPr>
+        <w:t>(</w:t>
+      </w:r>
+      <w:proofErr w:type="gramStart"/>
+      <w:r>
+        <w:rPr>
+          <w:lang w:val="en-GB"/>
+        </w:rPr>
+        <w:t>);</w:t>
+      </w:r>
+      <w:proofErr w:type="gramEnd"/>
+    </w:p>
+    <w:p>
+      <w:pPr>
+        <w:spacing w:after="0"/>
+        <w:rPr>
+          <w:lang w:val="en-GB"/>
+        </w:rPr>
+      </w:pPr>
+    </w:p>
+    <w:p>
+      <w:pPr>
+        <w:spacing w:after="0"/>
+        <w:rPr>
+          <w:lang w:val="en-GB"/>
+        </w:rPr>
+      </w:pPr>
+      <w:r>
+        <w:rPr>
+          <w:lang w:val="en-GB"/>
+        </w:rPr>
+        <w:t xml:space="preserve">    // Execute dynamic LINQ</w:t>
+      </w:r>
+    </w:p>
+    <w:p>
+      <w:pPr>
+        <w:spacing w:after="0"/>
+        <w:rPr>
+          <w:lang w:val="en-GB"/>
+        </w:rPr>
+      </w:pPr>
+      <w:r>
+        <w:rPr>
+          <w:lang w:val="en-GB"/>
+        </w:rPr>
+        <w:t xml:space="preserve">    return </w:t>
+      </w:r>
+      <w:proofErr w:type="spellStart"/>
+      <w:proofErr w:type="gramStart"/>
+      <w:r>
+        <w:rPr>
+          <w:lang w:val="en-GB"/>
+        </w:rPr>
+        <w:t>queryable.Any</w:t>
+      </w:r>
+      <w:proofErr w:type="spellEnd"/>
+      <w:proofErr w:type="gramEnd"/>
+      <w:r>
+        <w:rPr>
+          <w:lang w:val="en-GB"/>
+        </w:rPr>
+        <w:t>(normalized</w:t>
+      </w:r>
+      <w:proofErr w:type="gramStart"/>
+      <w:r>
+        <w:rPr>
+          <w:lang w:val="en-GB"/>
+        </w:rPr>
+        <w:t>);</w:t>
+      </w:r>
+      <w:proofErr w:type="gramEnd"/>
+    </w:p>
+    <w:p>
+      <w:pPr>
+        <w:spacing w:after="0"/>
+        <w:rPr>
+          <w:lang w:val="en-GB"/>
+        </w:rPr>
+      </w:pPr>
+      <w:r>
+        <w:rPr>
+          <w:lang w:val="en-GB"/>
+        </w:rPr>
+        <w:t>}</w:t>
+      </w:r>
+    </w:p>
+    <w:p>
+      <w:pPr>
+        <w:spacing w:after="0"/>
+        <w:rPr>
+          <w:lang w:val="en-GB"/>
+        </w:rPr>
+      </w:pPr>
+    </w:p>
+    <w:p>
+      <w:pPr>
+        <w:spacing w:after="0"/>
+        <w:rPr>
+          <w:lang w:val="en-GB"/>
+        </w:rPr>
+      </w:pPr>
+      <w:r>
+        <w:rPr>
+          <w:lang w:val="en-GB"/>
+        </w:rPr>
+        <w:t xml:space="preserve">private string </w:t>
+      </w:r>
+      <w:proofErr w:type="spellStart"/>
+      <w:proofErr w:type="gramStart"/>
+      <w:r>
+        <w:rPr>
+          <w:lang w:val="en-GB"/>
+        </w:rPr>
+        <w:t>NormalizeExpression</w:t>
+      </w:r>
+      <w:proofErr w:type="spellEnd"/>
+      <w:r>
+        <w:rPr>
+          <w:lang w:val="en-GB"/>
+        </w:rPr>
+        <w:t>(</w:t>
+      </w:r>
+      <w:proofErr w:type="gramEnd"/>
+      <w:r>
+        <w:rPr>
+          <w:lang w:val="en-GB"/>
+        </w:rPr>
+        <w:t>string expression)</w:t>
+      </w:r>
+    </w:p>
+    <w:p>
+      <w:pPr>
+        <w:spacing w:after="0"/>
+        <w:rPr>
+          <w:lang w:val="en-GB"/>
+        </w:rPr>
+      </w:pPr>
+      <w:r>
+        <w:rPr>
+          <w:lang w:val="en-GB"/>
+        </w:rPr>
+        <w:t>{</w:t>
+      </w:r>
+    </w:p>
+    <w:p>
+      <w:pPr>
+        <w:spacing w:after="0"/>
+        <w:rPr>
+          <w:lang w:val="en-GB"/>
+        </w:rPr>
+      </w:pPr>
+      <w:r>
+        <w:rPr>
+          <w:lang w:val="en-GB"/>
+        </w:rPr>
+        <w:t xml:space="preserve">    try</w:t>
+      </w:r>
+    </w:p>
+    <w:p>
+      <w:pPr>
+        <w:spacing w:after="0"/>
+        <w:rPr>
+          <w:lang w:val="en-GB"/>
+        </w:rPr>
+      </w:pPr>
+      <w:r>
+        <w:rPr>
+          <w:lang w:val="en-GB"/>
+        </w:rPr>
+        <w:t xml:space="preserve">    {</w:t>
+      </w:r>
+    </w:p>
+    <w:p>
+      <w:pPr>
+        <w:spacing w:after="0"/>
+        <w:rPr>
+          <w:lang w:val="en-GB"/>
+        </w:rPr>
+      </w:pPr>
+      <w:r>
+        <w:rPr>
+          <w:lang w:val="en-GB"/>
+        </w:rPr>
+        <w:t xml:space="preserve">        if (</w:t>
+      </w:r>
+      <w:proofErr w:type="spellStart"/>
+      <w:proofErr w:type="gramStart"/>
+      <w:r>
+        <w:rPr>
+          <w:lang w:val="en-GB"/>
+        </w:rPr>
+        <w:t>string.IsNullOrWhiteSpace</w:t>
+      </w:r>
+      <w:proofErr w:type="spellEnd"/>
+      <w:proofErr w:type="gramEnd"/>
+      <w:r>
+        <w:rPr>
+          <w:lang w:val="en-GB"/>
+        </w:rPr>
+        <w:t>(expression))</w:t>
+      </w:r>
+    </w:p>
+    <w:p>
+      <w:pPr>
+        <w:spacing w:after="0"/>
+        <w:rPr>
+          <w:lang w:val="en-GB"/>
+        </w:rPr>
+      </w:pPr>
+      <w:r>
+        <w:rPr>
+          <w:lang w:val="en-GB"/>
+        </w:rPr>
+        <w:t xml:space="preserve">            return </w:t>
+      </w:r>
+      <w:proofErr w:type="gramStart"/>
+      <w:r>
+        <w:rPr>
+          <w:lang w:val="en-GB"/>
+        </w:rPr>
+        <w:t>expression;</w:t>
+      </w:r>
+      <w:proofErr w:type="gramEnd"/>
+    </w:p>
+    <w:p>
+      <w:pPr>
+        <w:spacing w:after="0"/>
+        <w:rPr>
+          <w:lang w:val="en-GB"/>
+        </w:rPr>
+      </w:pPr>
+    </w:p>
+    <w:p>
+      <w:pPr>
+        <w:spacing w:after="0"/>
+        <w:rPr>
+          <w:lang w:val="en-GB"/>
+        </w:rPr>
+      </w:pPr>
+      <w:r>
+        <w:rPr>
+          <w:lang w:val="en-GB"/>
+        </w:rPr>
+        <w:t xml:space="preserve">        // Convert SQL-style to C# style</w:t>
+      </w:r>
+    </w:p>
+    <w:p>
+      <w:pPr>
+        <w:spacing w:after="0"/>
+        <w:rPr>
+          <w:lang w:val="en-GB"/>
+        </w:rPr>
+      </w:pPr>
+      <w:r>
+        <w:rPr>
+          <w:lang w:val="en-GB"/>
+        </w:rPr>
+        <w:t xml:space="preserve">        expression = </w:t>
+      </w:r>
+      <w:proofErr w:type="spellStart"/>
+      <w:r>
+        <w:rPr>
+          <w:lang w:val="en-GB"/>
+        </w:rPr>
+        <w:t>Regex.Replace</w:t>
+      </w:r>
+      <w:proofErr w:type="spellEnd"/>
+      <w:r>
+        <w:rPr>
+          <w:lang w:val="en-GB"/>
+        </w:rPr>
+        <w:t xml:space="preserve">(expression, @"\bAND\b", "&amp;&amp;", </w:t>
+      </w:r>
+      <w:proofErr w:type="spellStart"/>
+      <w:r>
+        <w:rPr>
+          <w:lang w:val="en-GB"/>
+        </w:rPr>
+        <w:t>RegexOptions.IgnoreCase</w:t>
+      </w:r>
+      <w:proofErr w:type="spellEnd"/>
+      <w:proofErr w:type="gramStart"/>
+      <w:r>
+        <w:rPr>
+          <w:lang w:val="en-GB"/>
+        </w:rPr>
+        <w:t>);</w:t>
+      </w:r>
+      <w:proofErr w:type="gramEnd"/>
+    </w:p>
+    <w:p>
+      <w:pPr>
+        <w:spacing w:after="0"/>
+        <w:rPr>
+          <w:lang w:val="en-GB"/>
+        </w:rPr>
+      </w:pPr>
+      <w:r>
+        <w:rPr>
+          <w:lang w:val="en-GB"/>
+        </w:rPr>
+        <w:lastRenderedPageBreak/>
+        <w:t xml:space="preserve">        expression = </w:t>
+      </w:r>
+      <w:proofErr w:type="spellStart"/>
+      <w:r>
+        <w:rPr>
+          <w:lang w:val="en-GB"/>
+        </w:rPr>
+        <w:t>Regex.Replace</w:t>
+      </w:r>
+      <w:proofErr w:type="spellEnd"/>
+      <w:r>
+        <w:rPr>
+          <w:lang w:val="en-GB"/>
+        </w:rPr>
+        <w:t xml:space="preserve">(expression, @"\bOR\b", "||", </w:t>
+      </w:r>
+      <w:proofErr w:type="spellStart"/>
+      <w:r>
+        <w:rPr>
+          <w:lang w:val="en-GB"/>
+        </w:rPr>
+        <w:t>RegexOptions.IgnoreCase</w:t>
+      </w:r>
+      <w:proofErr w:type="spellEnd"/>
+      <w:proofErr w:type="gramStart"/>
+      <w:r>
+        <w:rPr>
+          <w:lang w:val="en-GB"/>
+        </w:rPr>
+        <w:t>);</w:t>
+      </w:r>
+      <w:proofErr w:type="gramEnd"/>
+    </w:p>
+    <w:p>
+      <w:pPr>
+        <w:spacing w:after="0"/>
+        <w:rPr>
+          <w:lang w:val="en-GB"/>
+        </w:rPr>
+      </w:pPr>
+    </w:p>
+    <w:p>
+      <w:pPr>
+        <w:spacing w:after="0"/>
+        <w:rPr>
+          <w:lang w:val="en-GB"/>
+        </w:rPr>
+      </w:pPr>
+      <w:r>
+        <w:rPr>
+          <w:lang w:val="en-GB"/>
+        </w:rPr>
+        <w:t xml:space="preserve">        // Convert "=" to "==" safely</w:t>
+      </w:r>
+    </w:p>
+    <w:p>
+      <w:pPr>
+        <w:spacing w:after="0"/>
+        <w:rPr>
+          <w:lang w:val="en-GB"/>
+        </w:rPr>
+      </w:pPr>
+      <w:r>
+        <w:rPr>
+          <w:lang w:val="en-GB"/>
+        </w:rPr>
+        <w:t xml:space="preserve">        expression = </w:t>
+      </w:r>
+      <w:proofErr w:type="spellStart"/>
+      <w:r>
+        <w:rPr>
+          <w:lang w:val="en-GB"/>
+        </w:rPr>
+        <w:t>Regex.Replace</w:t>
+      </w:r>
+      <w:proofErr w:type="spellEnd"/>
+      <w:r>
+        <w:rPr>
+          <w:lang w:val="en-GB"/>
+        </w:rPr>
+        <w:t>(expression, @"</w:t>
+      </w:r>
+      <w:proofErr w:type="gramStart"/>
+      <w:r>
+        <w:rPr>
+          <w:lang w:val="en-GB"/>
+        </w:rPr>
+        <w:t>(?&lt;![=!&lt;</w:t>
+      </w:r>
+      <w:proofErr w:type="gramEnd"/>
+      <w:r>
+        <w:rPr>
+          <w:lang w:val="en-GB"/>
+        </w:rPr>
+        <w:t>&gt;</w:t>
+      </w:r>
+      <w:proofErr w:type="gramStart"/>
+      <w:r>
+        <w:rPr>
+          <w:lang w:val="en-GB"/>
+        </w:rPr>
+        <w:t>])=</w:t>
+      </w:r>
+      <w:proofErr w:type="gramEnd"/>
+      <w:r>
+        <w:rPr>
+          <w:lang w:val="en-GB"/>
+        </w:rPr>
+        <w:t>(?!=)", "=="</w:t>
+      </w:r>
+      <w:proofErr w:type="gramStart"/>
+      <w:r>
+        <w:rPr>
+          <w:lang w:val="en-GB"/>
+        </w:rPr>
+        <w:t>);</w:t>
+      </w:r>
+      <w:proofErr w:type="gramEnd"/>
+    </w:p>
+    <w:p>
+      <w:pPr>
+        <w:spacing w:after="0"/>
+        <w:rPr>
+          <w:lang w:val="en-GB"/>
+        </w:rPr>
+      </w:pPr>
+    </w:p>
+    <w:p>
+      <w:pPr>
+        <w:spacing w:after="0"/>
+        <w:rPr>
+          <w:lang w:val="en-GB"/>
+        </w:rPr>
+      </w:pPr>
+      <w:r>
+        <w:rPr>
+          <w:lang w:val="en-GB"/>
+        </w:rPr>
+        <w:t xml:space="preserve">        // Convert "&lt;&gt;" to </w:t>
+      </w:r>
+      <w:proofErr w:type="gramStart"/>
+      <w:r>
+        <w:rPr>
+          <w:lang w:val="en-GB"/>
+        </w:rPr>
+        <w:t>"!=</w:t>
+      </w:r>
+      <w:proofErr w:type="gramEnd"/>
+      <w:r>
+        <w:rPr>
+          <w:lang w:val="en-GB"/>
+        </w:rPr>
+        <w:t>"</w:t>
+      </w:r>
+    </w:p>
+    <w:p>
+      <w:pPr>
+        <w:spacing w:after="0"/>
+        <w:rPr>
+          <w:lang w:val="en-GB"/>
+        </w:rPr>
+      </w:pPr>
+      <w:r>
+        <w:rPr>
+          <w:lang w:val="en-GB"/>
+        </w:rPr>
+        <w:t xml:space="preserve">        expression = </w:t>
+      </w:r>
+      <w:proofErr w:type="spellStart"/>
+      <w:proofErr w:type="gramStart"/>
+      <w:r>
+        <w:rPr>
+          <w:lang w:val="en-GB"/>
+        </w:rPr>
+        <w:t>expression.Replace</w:t>
+      </w:r>
+      <w:proofErr w:type="spellEnd"/>
+      <w:proofErr w:type="gramEnd"/>
+      <w:r>
+        <w:rPr>
+          <w:lang w:val="en-GB"/>
+        </w:rPr>
+        <w:t xml:space="preserve">("&lt;&gt;", </w:t>
+      </w:r>
+      <w:proofErr w:type="gramStart"/>
+      <w:r>
+        <w:rPr>
+          <w:lang w:val="en-GB"/>
+        </w:rPr>
+        <w:t>"!=</w:t>
+      </w:r>
+      <w:proofErr w:type="gramEnd"/>
+      <w:r>
+        <w:rPr>
+          <w:lang w:val="en-GB"/>
+        </w:rPr>
+        <w:t>"</w:t>
+      </w:r>
+      <w:proofErr w:type="gramStart"/>
+      <w:r>
+        <w:rPr>
+          <w:lang w:val="en-GB"/>
+        </w:rPr>
+        <w:t>);</w:t>
+      </w:r>
+      <w:proofErr w:type="gramEnd"/>
+    </w:p>
+    <w:p>
+      <w:pPr>
+        <w:spacing w:after="0"/>
+        <w:rPr>
+          <w:lang w:val="en-GB"/>
+        </w:rPr>
+      </w:pPr>
+    </w:p>
+    <w:p>
+      <w:pPr>
+        <w:spacing w:after="0"/>
+        <w:rPr>
+          <w:lang w:val="en-GB"/>
+        </w:rPr>
+      </w:pPr>
+      <w:r>
+        <w:rPr>
+          <w:lang w:val="en-GB"/>
+        </w:rPr>
+        <w:t xml:space="preserve">        return </w:t>
+      </w:r>
+      <w:proofErr w:type="gramStart"/>
+      <w:r>
+        <w:rPr>
+          <w:lang w:val="en-GB"/>
+        </w:rPr>
+        <w:t>expression;</w:t>
+      </w:r>
+      <w:proofErr w:type="gramEnd"/>
+    </w:p>
+    <w:p>
+      <w:pPr>
+        <w:spacing w:after="0"/>
+        <w:rPr>
+          <w:lang w:val="en-GB"/>
+        </w:rPr>
+      </w:pPr>
+      <w:r>
+        <w:rPr>
+          <w:lang w:val="en-GB"/>
+        </w:rPr>
+        <w:t xml:space="preserve">    }</w:t>
+      </w:r>
+    </w:p>
+    <w:p>
+      <w:pPr>
+        <w:spacing w:after="0"/>
+        <w:rPr>
+          <w:lang w:val="en-GB"/>
+        </w:rPr>
+      </w:pPr>
+      <w:r>
+        <w:rPr>
+          <w:lang w:val="en-GB"/>
+        </w:rPr>
+        <w:t xml:space="preserve">    catch (Exception ex)</w:t>
+      </w:r>
+    </w:p>
+    <w:p>
+      <w:pPr>
+        <w:spacing w:after="0"/>
+        <w:rPr>
+          <w:lang w:val="en-GB"/>
+        </w:rPr>
+      </w:pPr>
+      <w:r>
+        <w:rPr>
+          <w:lang w:val="en-GB"/>
+        </w:rPr>
+        <w:t xml:space="preserve">    {</w:t>
+      </w:r>
+    </w:p>
+    <w:p>
+      <w:pPr>
+        <w:spacing w:after="0"/>
+        <w:rPr>
+          <w:lang w:val="en-GB"/>
+        </w:rPr>
+      </w:pPr>
+      <w:r>
+        <w:rPr>
+          <w:lang w:val="en-GB"/>
+        </w:rPr>
+        <w:t xml:space="preserve">        return </w:t>
+      </w:r>
+      <w:proofErr w:type="gramStart"/>
+      <w:r>
+        <w:rPr>
+          <w:lang w:val="en-GB"/>
+        </w:rPr>
+        <w:t>null;</w:t>
+      </w:r>
+      <w:proofErr w:type="gramEnd"/>
+    </w:p>
+    <w:p>
+      <w:pPr>
+        <w:spacing w:after="0"/>
+        <w:rPr>
+          <w:lang w:val="en-GB"/>
+        </w:rPr>
+      </w:pPr>
+      <w:r>
+        <w:rPr>
+          <w:lang w:val="en-GB"/>
+        </w:rPr>
+        <w:t xml:space="preserve">    }</w:t>
+      </w:r>
+    </w:p>
+    <w:p>
+      <w:pPr>
+        <w:spacing w:after="0"/>
+        <w:rPr>
+          <w:lang w:val="en-GB"/>
+        </w:rPr>
       </w:pPr>
       <w:r>
         <w:rPr>

</xml_diff>

<commit_message>
Bug fixing the workflow for sending system notification
</commit_message>
<xml_diff>
--- a/Documentation/AI Prompts/Vibe Coding - Workflow Configuration.docx
+++ b/Documentation/AI Prompts/Vibe Coding - Workflow Configuration.docx
@@ -24459,6 +24459,120 @@
           <w:lang w:val="en-GB"/>
         </w:rPr>
         <w:t>}</w:t>
+      </w:r>
+    </w:p>
+    <w:p>
+      <w:pPr>
+        <w:spacing w:after="0"/>
+        <w:rPr>
+          <w:lang w:val="en-GB"/>
+        </w:rPr>
+      </w:pPr>
+    </w:p>
+    <w:p>
+      <w:pPr>
+        <w:spacing w:after="0"/>
+        <w:rPr>
+          <w:b/>
+          <w:bCs/>
+          <w:color w:val="EE0000"/>
+          <w:u w:val="single"/>
+          <w:lang w:val="en-GB"/>
+        </w:rPr>
+      </w:pPr>
+      <w:r>
+        <w:rPr>
+          <w:b/>
+          <w:bCs/>
+          <w:color w:val="EE0000"/>
+          <w:u w:val="single"/>
+          <w:lang w:val="en-GB"/>
+        </w:rPr>
+        <w:t>AI Prompt:</w:t>
+      </w:r>
+    </w:p>
+    <w:p>
+      <w:pPr>
+        <w:spacing w:after="0"/>
+        <w:rPr>
+          <w:lang w:val="en-GB"/>
+        </w:rPr>
+      </w:pPr>
+      <w:r>
+        <w:rPr>
+          <w:lang w:val="en-GB"/>
+        </w:rPr>
+        <w:t xml:space="preserve">Tell me how to return the physical file path that corresponds to the specified virtual path, </w:t>
+      </w:r>
+      <w:proofErr w:type="gramStart"/>
+      <w:r>
+        <w:rPr>
+          <w:lang w:val="en-GB"/>
+        </w:rPr>
+        <w:t>similar to</w:t>
+      </w:r>
+      <w:proofErr w:type="gramEnd"/>
+      <w:r>
+        <w:rPr>
+          <w:lang w:val="en-GB"/>
+        </w:rPr>
+        <w:t xml:space="preserve"> </w:t>
+      </w:r>
+      <w:proofErr w:type="spellStart"/>
+      <w:r>
+        <w:rPr>
+          <w:lang w:val="en-GB"/>
+        </w:rPr>
+        <w:t>Server.MapPath</w:t>
+      </w:r>
+      <w:proofErr w:type="spellEnd"/>
+      <w:r>
+        <w:rPr>
+          <w:lang w:val="en-GB"/>
+        </w:rPr>
+        <w:t>, using Blazor Server App and .Net 8.0.</w:t>
+      </w:r>
+    </w:p>
+    <w:p>
+      <w:pPr>
+        <w:spacing w:after="0"/>
+        <w:rPr>
+          <w:lang w:val="en-GB"/>
+        </w:rPr>
+      </w:pPr>
+    </w:p>
+    <w:p>
+      <w:pPr>
+        <w:spacing w:after="0"/>
+        <w:rPr>
+          <w:lang w:val="en-GB"/>
+        </w:rPr>
+      </w:pPr>
+      <w:r>
+        <w:rPr>
+          <w:lang w:val="en-GB"/>
+        </w:rPr>
+        <w:t xml:space="preserve">Error: </w:t>
+      </w:r>
+      <w:r>
+        <w:rPr>
+          <w:lang w:val="en-GB"/>
+        </w:rPr>
+        <w:t>The type or namespace name '</w:t>
+      </w:r>
+      <w:proofErr w:type="spellStart"/>
+      <w:r>
+        <w:rPr>
+          <w:lang w:val="en-GB"/>
+        </w:rPr>
+        <w:t>IWebHostEnvironment</w:t>
+      </w:r>
+      <w:proofErr w:type="spellEnd"/>
+      <w:r>
+        <w:rPr>
+          <w:lang w:val="en-GB"/>
+        </w:rPr>
+        <w:t>' could not be found (are you missing a using directive or an assembly reference?)</w:t>
       </w:r>
     </w:p>
     <w:sectPr>

</xml_diff>